<commit_message>
Am adaugat un qr code independent(generat de mine) , aceasta este varianta dinaintea ultimului demo.
</commit_message>
<xml_diff>
--- a/Documentations/The-Inventory-EN.docx
+++ b/Documentations/The-Inventory-EN.docx
@@ -19,7 +19,7 @@
           <w:noProof/>
         </w:rPr>
         <w:drawing>
-          <wp:inline distT="0" distB="0" distL="0" distR="0" wp14:anchorId="5B6B9178" wp14:editId="1713257A">
+          <wp:inline distT="0" distB="0" distL="0" distR="0" wp14:anchorId="5B6B9178" wp14:editId="5F5CB1FB">
             <wp:extent cx="861649" cy="740979"/>
             <wp:effectExtent l="0" t="0" r="0" b="2540"/>
             <wp:docPr id="1402543487" name="Imagine 3" descr="Universitatea Ștefan cel Mare din Suceava | EUROSCI Network"/>
@@ -4611,7 +4611,7 @@
           <w:lang w:val="ro-RO"/>
         </w:rPr>
         <w:drawing>
-          <wp:anchor distT="0" distB="0" distL="114300" distR="114300" simplePos="0" relativeHeight="251672576" behindDoc="1" locked="0" layoutInCell="1" allowOverlap="1" wp14:anchorId="54D53C5C" wp14:editId="0CB857F6">
+          <wp:anchor distT="0" distB="0" distL="114300" distR="114300" simplePos="0" relativeHeight="251672576" behindDoc="1" locked="0" layoutInCell="1" allowOverlap="1" wp14:anchorId="54D53C5C" wp14:editId="4882DCC8">
             <wp:simplePos x="0" y="0"/>
             <wp:positionH relativeFrom="margin">
               <wp:posOffset>1121312</wp:posOffset>
@@ -10512,21 +10512,21 @@
           <w:szCs w:val="28"/>
         </w:rPr>
         <w:drawing>
-          <wp:anchor distT="0" distB="0" distL="114300" distR="114300" simplePos="0" relativeHeight="251673600" behindDoc="1" locked="0" layoutInCell="1" allowOverlap="1" wp14:anchorId="7A25B59F" wp14:editId="78052A65">
+          <wp:anchor distT="0" distB="0" distL="114300" distR="114300" simplePos="0" relativeHeight="251673600" behindDoc="1" locked="0" layoutInCell="1" allowOverlap="1" wp14:anchorId="7A25B59F" wp14:editId="71D130DB">
             <wp:simplePos x="0" y="0"/>
             <wp:positionH relativeFrom="page">
-              <wp:posOffset>2498725</wp:posOffset>
+              <wp:posOffset>2501900</wp:posOffset>
             </wp:positionH>
             <wp:positionV relativeFrom="margin">
-              <wp:posOffset>4906010</wp:posOffset>
+              <wp:posOffset>4912995</wp:posOffset>
             </wp:positionV>
-            <wp:extent cx="3552825" cy="3566795"/>
-            <wp:effectExtent l="0" t="0" r="9525" b="0"/>
+            <wp:extent cx="3552825" cy="3552825"/>
+            <wp:effectExtent l="0" t="0" r="9525" b="9525"/>
             <wp:wrapTight wrapText="bothSides">
               <wp:wrapPolygon edited="0">
                 <wp:start x="0" y="0"/>
-                <wp:lineTo x="0" y="21458"/>
-                <wp:lineTo x="21542" y="21458"/>
+                <wp:lineTo x="0" y="21542"/>
+                <wp:lineTo x="21542" y="21542"/>
                 <wp:lineTo x="21542" y="0"/>
                 <wp:lineTo x="0" y="0"/>
               </wp:wrapPolygon>
@@ -10539,7 +10539,7 @@
               <a:graphicData uri="http://schemas.openxmlformats.org/drawingml/2006/picture">
                 <pic:pic xmlns:pic="http://schemas.openxmlformats.org/drawingml/2006/picture">
                   <pic:nvPicPr>
-                    <pic:cNvPr id="1157834042" name="Imagine 1157834042"/>
+                    <pic:cNvPr id="1157834042" name="Imagine 1"/>
                     <pic:cNvPicPr/>
                   </pic:nvPicPr>
                   <pic:blipFill>
@@ -10557,7 +10557,7 @@
                   <pic:spPr>
                     <a:xfrm>
                       <a:off x="0" y="0"/>
-                      <a:ext cx="3552825" cy="3566795"/>
+                      <a:ext cx="3552825" cy="3552825"/>
                     </a:xfrm>
                     <a:prstGeom prst="rect">
                       <a:avLst/>
@@ -16242,6 +16242,7 @@
   <w:style w:type="character" w:default="1" w:styleId="Fontdeparagrafimplicit">
     <w:name w:val="Default Paragraph Font"/>
     <w:uiPriority w:val="1"/>
+    <w:semiHidden/>
     <w:unhideWhenUsed/>
   </w:style>
   <w:style w:type="table" w:default="1" w:styleId="TabelNormal">

</xml_diff>